<commit_message>
Add Linux scheduler MVP and refresh project docs
</commit_message>
<xml_diff>
--- a/assets/AdaptiveSched_Implementation_Report.docx
+++ b/assets/AdaptiveSched_Implementation_Report.docx
@@ -4,6 +4,45 @@
   <w:body>
     <w:p>
       <w:pPr>
+        <w:pStyle w:val="Title"/>
+      </w:pPr>
+      <w:r>
+        <w:t>Implementation Status Addendum - October 21, 2026</w:t>
+      </w:r>
+    </w:p>
+    <w:p>
+      <w:r>
+        <w:t>This addendum supersedes conflicting implementation-status statements in the report body. See docs/MVP_STATUS.md for the current implementation record and Linux validation checklist.</w:t>
+      </w:r>
+    </w:p>
+    <w:p>
+      <w:r>
+        <w:t>UCB1, Thompson Sampling, epsilon-greedy, and reward computation are implemented in Python. The demo still uses simulated metrics and scheduler behavior.</w:t>
+      </w:r>
+    </w:p>
+    <w:p>
+      <w:r>
+        <w:t>A Linux MVP now includes a Python procfs collector and a manager for installed foreground scx_* binaries. Linux real mode has not yet been validated on a supported Linux host; the C/perf collector and ctypes bridge remain future work.</w:t>
+      </w:r>
+    </w:p>
+    <w:p>
+      <w:r>
+        <w:t>The procfs collector reports CPU utilization, context-switch rate, and average run-queue wait. It does not measure workload p99 latency, throughput, IPC, or cache misses; unavailable values are disclosed by the API and dashboard.</w:t>
+      </w:r>
+    </w:p>
+    <w:p>
+      <w:r>
+        <w:t>The updated automated suite passes 13 tests using the declared requirements. Linux host integration and real sched_ext recovery remain untested.</w:t>
+      </w:r>
+    </w:p>
+    <w:p>
+      <w:r>
+        <w:t>A repeatable Linux CPU microbenchmark runner now compares the default scheduler with installed scx schedulers; no benchmark results have yet been collected in this workspace.</w:t>
+      </w:r>
+    </w:p>
+    <w:p>
+      <w:pPr>
+        <w:pageBreakBefore/>
         <w:spacing w:after="60"/>
       </w:pPr>
       <w:r>

</xml_diff>